<commit_message>
Actualiza guia Player con restriccion de auto-apuesta
- Reglas basicas: nuevo bullet explicando que solo puedes apostar
  a tu propio lado en tu partido
- FAQ: matiza respuesta de auto-apuesta (si, pero solo a tu lado)

Co-Authored-By: Claude Sonnet 4.6 <noreply@anthropic.com>
</commit_message>
<xml_diff>
--- a/guia_betting_rydercup2026_Player.docx
+++ b/guia_betting_rydercup2026_Player.docx
@@ -1,5 +1,36 @@
 
-<file path=word/document.xml><?xml version="1.0" encoding="utf-8"?>
+<file path=docProps\app.xml><?xml version="1.0" encoding="utf-8"?>
+<Properties xmlns="http://schemas.openxmlformats.org/officeDocument/2006/extended-properties" xmlns:vt="http://schemas.openxmlformats.org/officeDocument/2006/docPropsVTypes">
+  <Template>Normal</Template>
+  <TotalTime>1</TotalTime>
+  <Pages>5</Pages>
+  <Words>1068</Words>
+  <Characters>5159</Characters>
+  <Application>Microsoft Office Word</Application>
+  <DocSecurity>0</DocSecurity>
+  <Lines>166</Lines>
+  <Paragraphs>119</Paragraphs>
+  <ScaleCrop>false</ScaleCrop>
+  <Company/>
+  <LinksUpToDate>false</LinksUpToDate>
+  <CharactersWithSpaces>6108</CharactersWithSpaces>
+  <SharedDoc>false</SharedDoc>
+  <HyperlinksChanged>false</HyperlinksChanged>
+  <AppVersion>16.0000</AppVersion>
+</Properties>
+</file>
+
+<file path=docProps\core.xml><?xml version="1.0" encoding="utf-8"?>
+<cp:coreProperties xmlns:cp="http://schemas.openxmlformats.org/package/2006/metadata/core-properties" xmlns:dc="http://purl.org/dc/elements/1.1/" xmlns:dcterms="http://purl.org/dc/terms/" xmlns:dcmitype="http://purl.org/dc/dcmitype/" xmlns:xsi="http://www.w3.org/2001/XMLSchema-instance">
+  <dc:creator>Un-named</dc:creator>
+  <cp:lastModifiedBy>Suarez de Tangil, Fernando</cp:lastModifiedBy>
+  <cp:revision>3</cp:revision>
+  <dcterms:created xsi:type="dcterms:W3CDTF">2026-09-18T06:57:00Z</dcterms:created>
+  <dcterms:modified xsi:type="dcterms:W3CDTF">2026-09-18T09:00:00Z</dcterms:modified>
+</cp:coreProperties>
+</file>
+
+<file path=word\document.xml><?xml version="1.0" encoding="utf-8"?>
 <w:document xmlns:wpc="http://schemas.microsoft.com/office/word/2010/wordprocessingCanvas" xmlns:cx="http://schemas.microsoft.com/office/drawing/2014/chartex" xmlns:cx1="http://schemas.microsoft.com/office/drawing/2015/9/8/chartex" xmlns:cx2="http://schemas.microsoft.com/office/drawing/2015/10/21/chartex" xmlns:cx3="http://schemas.microsoft.com/office/drawing/2016/5/9/chartex" xmlns:cx4="http://schemas.microsoft.com/office/drawing/2016/5/10/chartex" xmlns:cx5="http://schemas.microsoft.com/office/drawing/2016/5/11/chartex" xmlns:cx6="http://schemas.microsoft.com/office/drawing/2016/5/12/chartex" xmlns:cx7="http://schemas.microsoft.com/office/drawing/2016/5/13/chartex" xmlns:cx8="http://schemas.microsoft.com/office/drawing/2016/5/14/chartex" xmlns:mc="http://schemas.openxmlformats.org/markup-compatibility/2006" xmlns:aink="http://schemas.microsoft.com/office/drawing/2016/ink" xmlns:am3d="http://schemas.microsoft.com/office/drawing/2017/model3d" xmlns:o="urn:schemas-microsoft-com:office:office" xmlns:oel="http://schemas.microsoft.com/office/2019/extlst" xmlns:r="http://schemas.openxmlformats.org/officeDocument/2006/relationships" xmlns:m="http://schemas.openxmlformats.org/officeDocument/2006/math" xmlns:v="urn:schemas-microsoft-com:vml" xmlns:wp14="http://schemas.microsoft.com/office/word/2010/wordprocessingDrawing" xmlns:wp="http://schemas.openxmlformats.org/drawingml/2006/wordprocessingDrawing" xmlns:w10="urn:schemas-microsoft-com:office:word" xmlns:w="http://schemas.openxmlformats.org/wordprocessingml/2006/main" xmlns:w14="http://schemas.microsoft.com/office/word/2010/wordml" xmlns:w15="http://schemas.microsoft.com/office/word/2012/wordml" xmlns:w16cei="http://schemas.microsoft.com/office/word/2026/wordml/cei" xmlns:w16cex="http://schemas.microsoft.com/office/word/2018/wordml/cex" xmlns:w16cid="http://schemas.microsoft.com/office/word/2016/wordml/cid" xmlns:w16="http://schemas.microsoft.com/office/word/2018/wordml" xmlns:w16du="http://schemas.microsoft.com/office/word/2023/wordml/word16du" xmlns:w16sdtdh="http://schemas.microsoft.com/office/word/2020/wordml/sdtdatahash" xmlns:w16sdtfl="http://schemas.microsoft.com/office/word/2024/wordml/sdtformatlock" xmlns:w16se="http://schemas.microsoft.com/office/word/2015/wordml/symex" xmlns:wpg="http://schemas.microsoft.com/office/word/2010/wordprocessingGroup" xmlns:wpi="http://schemas.microsoft.com/office/word/2010/wordprocessingInk" xmlns:wne="http://schemas.microsoft.com/office/word/2006/wordml" xmlns:wps="http://schemas.microsoft.com/office/word/2010/wordprocessingShape" mc:Ignorable="w14 w15 w16se w16cid w16 w16cex w16sdtdh w16sdtfl w16du wp14">
   <w:body>
     <w:p>
@@ -122,8 +153,22 @@
                 <w:sz w:val="22"/>
                 <w:szCs w:val="22"/>
               </w:rPr>
-              <w:t>🐺</w:t>
-            </w:r>
+              <w:t xml:space="preserve">🐺 Lobos</w:t>
+            </w:r>
+          </w:p>
+        </w:tc>
+        <w:tc>
+          <w:tcPr>
+            <w:tcW w:w="4752" w:type="dxa"/>
+            <w:shd w:val="clear" w:color="auto" w:fill="1A1A2E"/>
+            <w:tcMar>
+              <w:top w:w="80" w:type="dxa"/>
+              <w:left w:w="120" w:type="dxa"/>
+              <w:bottom w:w="80" w:type="dxa"/>
+              <w:right w:w="120" w:type="dxa"/>
+            </w:tcMar>
+          </w:tcPr>
+          <w:p>
             <w:r>
               <w:rPr>
                 <w:b/>
@@ -132,41 +177,7 @@
                 <w:sz w:val="22"/>
                 <w:szCs w:val="22"/>
               </w:rPr>
-              <w:t xml:space="preserve"> Lobos</w:t>
-            </w:r>
-          </w:p>
-        </w:tc>
-        <w:tc>
-          <w:tcPr>
-            <w:tcW w:w="4752" w:type="dxa"/>
-            <w:shd w:val="clear" w:color="auto" w:fill="1A1A2E"/>
-            <w:tcMar>
-              <w:top w:w="80" w:type="dxa"/>
-              <w:left w:w="120" w:type="dxa"/>
-              <w:bottom w:w="80" w:type="dxa"/>
-              <w:right w:w="120" w:type="dxa"/>
-            </w:tcMar>
-          </w:tcPr>
-          <w:p>
-            <w:r>
-              <w:rPr>
-                <w:b/>
-                <w:bCs/>
-                <w:color w:val="FFFFFF"/>
-                <w:sz w:val="22"/>
-                <w:szCs w:val="22"/>
-              </w:rPr>
-              <w:t>🎲</w:t>
-            </w:r>
-            <w:r>
-              <w:rPr>
-                <w:b/>
-                <w:bCs/>
-                <w:color w:val="FFFFFF"/>
-                <w:sz w:val="22"/>
-                <w:szCs w:val="22"/>
-              </w:rPr>
-              <w:t xml:space="preserve"> Locos</w:t>
+              <w:t xml:space="preserve">🎲 Locos</w:t>
             </w:r>
           </w:p>
         </w:tc>
@@ -238,17 +249,7 @@
           <w:sz w:val="22"/>
           <w:szCs w:val="22"/>
         </w:rPr>
-        <w:t xml:space="preserve">Banco: Alberto  ·  </w:t>
-      </w:r>
-      <w:r>
-        <w:rPr>
-          <w:b/>
-          <w:bCs/>
-          <w:color w:val="1A1A2E"/>
-          <w:sz w:val="22"/>
-          <w:szCs w:val="22"/>
-        </w:rPr>
-        <w:t>Máx. por jugador: 20€</w:t>
+        <w:t xml:space="preserve">Banco: Alberto  ·  Máx. por jugador: 20€</w:t>
       </w:r>
     </w:p>
     <w:p>
@@ -465,6 +466,24 @@
           <w:szCs w:val="22"/>
         </w:rPr>
         <w:t>Las apuestas son definitivas. No hay vuelta atrás salvo intervención divina (o de Alberto).</w:t>
+      </w:r>
+    </w:p>
+    <w:p>
+      <w:pPr>
+        <w:pStyle w:val="ListParagraph"/>
+        <w:numPr>
+          <w:ilvl w:val="0"/>
+          <w:numId w:val="1"/>
+        </w:numPr>
+        <w:spacing w:after="80"/>
+      </w:pPr>
+      <w:r>
+        <w:rPr>
+          <w:color w:val="1A1A2E"/>
+          <w:sz w:val="22"/>
+          <w:szCs w:val="22"/>
+        </w:rPr>
+        <w:t>Si juegas en un partido, solo puedes apostar a tu propio lado. No puedes apostar contra ti mismo — la app lo impide.</w:t>
       </w:r>
     </w:p>
     <w:p>
@@ -1553,7 +1572,7 @@
               <w:rPr>
                 <w:color w:val="1A1A2E"/>
               </w:rPr>
-              <w:t>Sí. Está permitido. Si quieres apostar a que te ganas a tu rival, adelante.</w:t>
+              <w:t>Sí, pero solo a tu propio lado. Puedes apostar a ganar tu partido — no a perderlo. La app bloquea automáticamente el pick del rival cuando juegas en ese partido.</w:t>
             </w:r>
           </w:p>
         </w:tc>
@@ -2052,17 +2071,7 @@
                 <w:sz w:val="24"/>
                 <w:szCs w:val="24"/>
               </w:rPr>
-              <w:t>📱</w:t>
-            </w:r>
-            <w:r>
-              <w:rPr>
-                <w:b/>
-                <w:bCs/>
-                <w:color w:val="1A1A2E"/>
-                <w:sz w:val="24"/>
-                <w:szCs w:val="24"/>
-              </w:rPr>
-              <w:t xml:space="preserve">  ACCESO RÁPIDO</w:t>
+              <w:t xml:space="preserve">📱  ACCESO RÁPIDO</w:t>
             </w:r>
           </w:p>
           <w:p>
@@ -2086,10 +2095,7 @@
           </w:p>
           <w:p>
             <w:r>
-              <w:t>B</w:t>
-            </w:r>
-            <w:r>
-              <w:t>anco: Alberto  ·  Máximo por jugador: 20€  ·  Sistema: Pari-mutuel</w:t>
+              <w:t>Banco: Alberto  ·  Máximo por jugador: 20€  ·  Sistema: Pari-mutuel</w:t>
             </w:r>
           </w:p>
         </w:tc>
@@ -2112,27 +2118,7 @@
           <w:sz w:val="18"/>
           <w:szCs w:val="18"/>
         </w:rPr>
-        <w:t xml:space="preserve">¡Que gane el mejor… y el que apostó a él!  </w:t>
-      </w:r>
-      <w:r>
-        <w:rPr>
-          <w:i/>
-          <w:iCs/>
-          <w:color w:val="555555"/>
-          <w:sz w:val="18"/>
-          <w:szCs w:val="18"/>
-        </w:rPr>
-        <w:t>🏌</w:t>
-      </w:r>
-      <w:r>
-        <w:rPr>
-          <w:i/>
-          <w:iCs/>
-          <w:color w:val="555555"/>
-          <w:sz w:val="18"/>
-          <w:szCs w:val="18"/>
-        </w:rPr>
-        <w:t>️⛳</w:t>
+        <w:t xml:space="preserve">¡Que gane el mejor… y el que apostó a él!  🏌️⛳</w:t>
       </w:r>
     </w:p>
     <w:sectPr>
@@ -2145,7 +2131,31 @@
 </w:document>
 </file>
 
-<file path=word/numbering.xml><?xml version="1.0" encoding="utf-8"?>
+<file path=word\fontTable.xml><?xml version="1.0" encoding="utf-8"?>
+<w:fonts xmlns:mc="http://schemas.openxmlformats.org/markup-compatibility/2006" xmlns:r="http://schemas.openxmlformats.org/officeDocument/2006/relationships" xmlns:w="http://schemas.openxmlformats.org/wordprocessingml/2006/main" xmlns:w14="http://schemas.microsoft.com/office/word/2010/wordml" xmlns:w15="http://schemas.microsoft.com/office/word/2012/wordml" xmlns:w16cex="http://schemas.microsoft.com/office/word/2018/wordml/cex" xmlns:w16cid="http://schemas.microsoft.com/office/word/2016/wordml/cid" xmlns:w16="http://schemas.microsoft.com/office/word/2018/wordml" xmlns:w16du="http://schemas.microsoft.com/office/word/2023/wordml/word16du" xmlns:w16sdtdh="http://schemas.microsoft.com/office/word/2020/wordml/sdtdatahash" xmlns:w16sdtfl="http://schemas.microsoft.com/office/word/2024/wordml/sdtformatlock" xmlns:w16se="http://schemas.microsoft.com/office/word/2015/wordml/symex" mc:Ignorable="w14 w15 w16se w16cid w16 w16cex w16sdtdh w16sdtfl w16du">
+  <w:font w:name="Times New Roman">
+    <w:panose1 w:val="02020603050405020304"/>
+    <w:charset w:val="00"/>
+    <w:family w:val="roman"/>
+    <w:pitch w:val="variable"/>
+    <w:sig w:usb0="E0002EFF" w:usb1="C000785B" w:usb2="00000009" w:usb3="00000000" w:csb0="000001FF" w:csb1="00000000"/>
+  </w:font>
+  <w:font w:name="Aptos Display">
+    <w:charset w:val="00"/>
+    <w:family w:val="swiss"/>
+    <w:pitch w:val="variable"/>
+    <w:sig w:usb0="20000287" w:usb1="00000003" w:usb2="00000000" w:usb3="00000000" w:csb0="0000019F" w:csb1="00000000"/>
+  </w:font>
+  <w:font w:name="Aptos">
+    <w:charset w:val="00"/>
+    <w:family w:val="swiss"/>
+    <w:pitch w:val="variable"/>
+    <w:sig w:usb0="20000287" w:usb1="00000003" w:usb2="00000000" w:usb3="00000000" w:csb0="0000019F" w:csb1="00000000"/>
+  </w:font>
+</w:fonts>
+</file>
+
+<file path=word\numbering.xml><?xml version="1.0" encoding="utf-8"?>
 <w:numbering xmlns:wpc="http://schemas.microsoft.com/office/word/2010/wordprocessingCanvas" xmlns:cx="http://schemas.microsoft.com/office/drawing/2014/chartex" xmlns:cx1="http://schemas.microsoft.com/office/drawing/2015/9/8/chartex" xmlns:cx2="http://schemas.microsoft.com/office/drawing/2015/10/21/chartex" xmlns:cx3="http://schemas.microsoft.com/office/drawing/2016/5/9/chartex" xmlns:cx4="http://schemas.microsoft.com/office/drawing/2016/5/10/chartex" xmlns:cx5="http://schemas.microsoft.com/office/drawing/2016/5/11/chartex" xmlns:cx6="http://schemas.microsoft.com/office/drawing/2016/5/12/chartex" xmlns:cx7="http://schemas.microsoft.com/office/drawing/2016/5/13/chartex" xmlns:cx8="http://schemas.microsoft.com/office/drawing/2016/5/14/chartex" xmlns:mc="http://schemas.openxmlformats.org/markup-compatibility/2006" xmlns:aink="http://schemas.microsoft.com/office/drawing/2016/ink" xmlns:am3d="http://schemas.microsoft.com/office/drawing/2017/model3d" xmlns:o="urn:schemas-microsoft-com:office:office" xmlns:oel="http://schemas.microsoft.com/office/2019/extlst" xmlns:r="http://schemas.openxmlformats.org/officeDocument/2006/relationships" xmlns:m="http://schemas.openxmlformats.org/officeDocument/2006/math" xmlns:v="urn:schemas-microsoft-com:vml" xmlns:wp14="http://schemas.microsoft.com/office/word/2010/wordprocessingDrawing" xmlns:wp="http://schemas.openxmlformats.org/drawingml/2006/wordprocessingDrawing" xmlns:w10="urn:schemas-microsoft-com:office:word" xmlns:w="http://schemas.openxmlformats.org/wordprocessingml/2006/main" xmlns:w14="http://schemas.microsoft.com/office/word/2010/wordml" xmlns:w15="http://schemas.microsoft.com/office/word/2012/wordml" xmlns:w16cei="http://schemas.microsoft.com/office/word/2026/wordml/cei" xmlns:w16cex="http://schemas.microsoft.com/office/word/2018/wordml/cex" xmlns:w16cid="http://schemas.microsoft.com/office/word/2016/wordml/cid" xmlns:w16="http://schemas.microsoft.com/office/word/2018/wordml" xmlns:w16du="http://schemas.microsoft.com/office/word/2023/wordml/word16du" xmlns:w16sdtdh="http://schemas.microsoft.com/office/word/2020/wordml/sdtdatahash" xmlns:w16sdtfl="http://schemas.microsoft.com/office/word/2024/wordml/sdtformatlock" xmlns:w16se="http://schemas.microsoft.com/office/word/2015/wordml/symex" xmlns:wpg="http://schemas.microsoft.com/office/word/2010/wordprocessingGroup" xmlns:wpi="http://schemas.microsoft.com/office/word/2010/wordprocessingInk" xmlns:wne="http://schemas.microsoft.com/office/word/2006/wordml" xmlns:wps="http://schemas.microsoft.com/office/word/2010/wordprocessingShape" mc:Ignorable="w14 w15 w16se w16cid w16 w16cex w16sdtdh w16sdtfl w16du wp14">
   <w:abstractNum w:abstractNumId="0" w15:restartNumberingAfterBreak="0">
     <w:nsid w:val="14443BFD"/>
@@ -2296,7 +2306,56 @@
 </w:numbering>
 </file>
 
-<file path=word/styles.xml><?xml version="1.0" encoding="utf-8"?>
+<file path=word\settings.xml><?xml version="1.0" encoding="utf-8"?>
+<w:settings xmlns:mc="http://schemas.openxmlformats.org/markup-compatibility/2006" xmlns:o="urn:schemas-microsoft-com:office:office" xmlns:r="http://schemas.openxmlformats.org/officeDocument/2006/relationships" xmlns:m="http://schemas.openxmlformats.org/officeDocument/2006/math" xmlns:v="urn:schemas-microsoft-com:vml" xmlns:w10="urn:schemas-microsoft-com:office:word" xmlns:w="http://schemas.openxmlformats.org/wordprocessingml/2006/main" xmlns:w14="http://schemas.microsoft.com/office/word/2010/wordml" xmlns:w15="http://schemas.microsoft.com/office/word/2012/wordml" xmlns:w16cex="http://schemas.microsoft.com/office/word/2018/wordml/cex" xmlns:w16cid="http://schemas.microsoft.com/office/word/2016/wordml/cid" xmlns:w16="http://schemas.microsoft.com/office/word/2018/wordml" xmlns:w16du="http://schemas.microsoft.com/office/word/2023/wordml/word16du" xmlns:w16sdtdh="http://schemas.microsoft.com/office/word/2020/wordml/sdtdatahash" xmlns:w16sdtfl="http://schemas.microsoft.com/office/word/2024/wordml/sdtformatlock" xmlns:w16se="http://schemas.microsoft.com/office/word/2015/wordml/symex" xmlns:sl="http://schemas.openxmlformats.org/schemaLibrary/2006/main" mc:Ignorable="w14 w15 w16se w16cid w16 w16cex w16sdtdh w16sdtfl w16du">
+  <w:zoom w:percent="100"/>
+  <w:displayBackgroundShape/>
+  <w:defaultTabStop w:val="720"/>
+  <w:characterSpacingControl w:val="doNotCompress"/>
+  <w:compat>
+    <w:compatSetting w:name="compatibilityMode" w:uri="http://schemas.microsoft.com/office/word" w:val="15"/>
+    <w:compatSetting w:name="overrideTableStyleFontSizeAndJustification" w:uri="http://schemas.microsoft.com/office/word" w:val="1"/>
+    <w:compatSetting w:name="enableOpenTypeFeatures" w:uri="http://schemas.microsoft.com/office/word" w:val="1"/>
+    <w:compatSetting w:name="doNotFlipMirrorIndents" w:uri="http://schemas.microsoft.com/office/word" w:val="1"/>
+    <w:compatSetting w:name="differentiateMultirowTableHeaders" w:uri="http://schemas.microsoft.com/office/word" w:val="1"/>
+    <w:compatSetting w:name="useWord2013TrackBottomHyphenation" w:uri="http://schemas.microsoft.com/office/word" w:val="1"/>
+  </w:compat>
+  <w:rsids>
+    <w:rsidRoot w:val="00F21CF3"/>
+    <w:rsid w:val="0013453D"/>
+    <w:rsid w:val="001902AF"/>
+    <w:rsid w:val="008E7DA5"/>
+    <w:rsid w:val="00F21CF3"/>
+  </w:rsids>
+  <m:mathPr>
+    <m:mathFont m:val="Cambria Math"/>
+    <m:brkBin m:val="before"/>
+    <m:brkBinSub m:val="--"/>
+    <m:smallFrac m:val="0"/>
+    <m:dispDef/>
+    <m:lMargin m:val="0"/>
+    <m:rMargin m:val="0"/>
+    <m:defJc m:val="centerGroup"/>
+    <m:wrapIndent m:val="1440"/>
+    <m:intLim m:val="subSup"/>
+    <m:naryLim m:val="undOvr"/>
+  </m:mathPr>
+  <w:themeFontLang/>
+  <w:clrSchemeMapping w:bg1="light1" w:t1="dark1" w:bg2="light2" w:t2="dark2" w:accent1="accent1" w:accent2="accent2" w:accent3="accent3" w:accent4="accent4" w:accent5="accent5" w:accent6="accent6" w:hyperlink="hyperlink" w:followedHyperlink="followedHyperlink"/>
+  <w:shapeDefaults>
+    <o:shapedefaults v:ext="edit" spidmax="1026"/>
+    <o:shapelayout v:ext="edit">
+      <o:idmap v:ext="edit" data="1"/>
+    </o:shapelayout>
+  </w:shapeDefaults>
+  <w:decimalSymbol w:val=","/>
+  <w:listSeparator w:val=";"/>
+  <w14:docId w14:val="30878F01"/>
+  <w15:docId w15:val="{69007EC5-D754-421C-ABE2-7D185C4A960B}"/>
+</w:settings>
+</file>
+
+<file path=word\styles.xml><?xml version="1.0" encoding="utf-8"?>
 <w:styles xmlns:mc="http://schemas.openxmlformats.org/markup-compatibility/2006" xmlns:r="http://schemas.openxmlformats.org/officeDocument/2006/relationships" xmlns:w="http://schemas.openxmlformats.org/wordprocessingml/2006/main" xmlns:w14="http://schemas.microsoft.com/office/word/2010/wordml" xmlns:w15="http://schemas.microsoft.com/office/word/2012/wordml" xmlns:w16cex="http://schemas.microsoft.com/office/word/2018/wordml/cex" xmlns:w16cid="http://schemas.microsoft.com/office/word/2016/wordml/cid" xmlns:w16="http://schemas.microsoft.com/office/word/2018/wordml" xmlns:w16du="http://schemas.microsoft.com/office/word/2023/wordml/word16du" xmlns:w16sdtdh="http://schemas.microsoft.com/office/word/2020/wordml/sdtdatahash" xmlns:w16sdtfl="http://schemas.microsoft.com/office/word/2024/wordml/sdtformatlock" xmlns:w16se="http://schemas.microsoft.com/office/word/2015/wordml/symex" mc:Ignorable="w14 w15 w16se w16cid w16 w16cex w16sdtdh w16sdtfl w16du">
   <w:docDefaults>
     <w:rPrDefault>
@@ -2885,7 +2944,7 @@
 </w:styles>
 </file>
 
-<file path=word/theme/theme1.xml><?xml version="1.0" encoding="utf-8"?>
+<file path=word\theme\theme1.xml><?xml version="1.0" encoding="utf-8"?>
 <a:theme xmlns:a="http://schemas.openxmlformats.org/drawingml/2006/main" name="Office Theme">
   <a:themeElements>
     <a:clrScheme name="Office">
@@ -3198,4 +3257,8 @@
     </a:ext>
   </a:extLst>
 </a:theme>
+</file>
+
+<file path=word\webSettings.xml><?xml version="1.0" encoding="utf-8"?>
+<w:webSettings xmlns:mc="http://schemas.openxmlformats.org/markup-compatibility/2006" xmlns:r="http://schemas.openxmlformats.org/officeDocument/2006/relationships" xmlns:w="http://schemas.openxmlformats.org/wordprocessingml/2006/main" xmlns:w14="http://schemas.microsoft.com/office/word/2010/wordml" xmlns:w15="http://schemas.microsoft.com/office/word/2012/wordml" xmlns:w16cex="http://schemas.microsoft.com/office/word/2018/wordml/cex" xmlns:w16cid="http://schemas.microsoft.com/office/word/2016/wordml/cid" xmlns:w16="http://schemas.microsoft.com/office/word/2018/wordml" xmlns:w16du="http://schemas.microsoft.com/office/word/2023/wordml/word16du" xmlns:w16sdtdh="http://schemas.microsoft.com/office/word/2020/wordml/sdtdatahash" xmlns:w16sdtfl="http://schemas.microsoft.com/office/word/2024/wordml/sdtformatlock" xmlns:w16se="http://schemas.microsoft.com/office/word/2015/wordml/symex" mc:Ignorable="w14 w15 w16se w16cid w16 w16cex w16sdtdh w16sdtfl w16du"/>
 </file>
</xml_diff>